<commit_message>
Dolphins: bring the book folder up to main
Takes The Dolphins' View of History as it is on origin/main (0863a4c): the
Latin America and Ottoman chapters, chapters 21-41 renumbered to 23-43, the
extended notes and Timeline, the repeated-sentence sweep, and
scripts/check_repeats.js. Folder only; nothing else in this checkout changed.

Co-Authored-By: Claude Sonnet 5.5 <noreply@anthropic.com>
</commit_message>
<xml_diff>
--- a/The Dolphins' View of History/chapters/18 - Machines and Manifestos - Renaissance, Enlightenment, and Industry.docx
+++ b/The Dolphins' View of History/chapters/18 - Machines and Manifestos - Renaissance, Enlightenment, and Industry.docx
@@ -90,15 +90,15 @@
         <w:spacing w:after="200"/>
       </w:pPr>
       <w:r>
-        <w:t xml:space="preserve">This is where the ratchet from the first chapter acquires an engine. For a million years the stored know-how of the species had been multiplied by muscle, its own or an animal's. Coal multiplied it by sunlight buried three hundred million years earlier. Wisdom had no equivalent fuel. Factory laws, public sanitation, and limits on child labor all came eventually, but each had to be argued for, one parliament and one generation at a time, after the damage was done.</w:t>
-      </w:r>
-    </w:p>
-    <w:p>
-      <w:pPr>
-        <w:spacing w:after="200"/>
-      </w:pPr>
-      <w:r>
-        <w:t xml:space="preserve">The other side of the ledger was immediate, and dolphin historians insist on stating it beside the productivity gains, not tucked in afterward: children as young as five or six worked textile mill floors on twelve-hour shifts; new industrial cities like Manchester grew so fast that sanitation and housing never caught up, and cholera outbreaks followed accordingly.</w:t>
+        <w:t xml:space="preserve">The ratchet found an engine. For a million years the stored know-how of the species had been multiplied by muscle, its own or an animal's. Coal multiplied it by sunlight buried three hundred million years earlier. Wisdom had no equivalent fuel. Factory laws, public sanitation, and limits on child labor all came eventually, but each had to be argued for, one parliament and one generation at a time, after the damage was done.</w:t>
+      </w:r>
+    </w:p>
+    <w:p>
+      <w:pPr>
+        <w:spacing w:after="200"/>
+      </w:pPr>
+      <w:r>
+        <w:t xml:space="preserve">The other side of the ledger was immediate, and dolphin historians set it beside the productivity gains, not tucked in afterward: children as young as five or six worked textile mill floors on twelve-hour shifts; new industrial cities like Manchester grew so fast that sanitation and housing never caught up, and cholera outbreaks followed accordingly.</w:t>
       </w:r>
     </w:p>
     <w:p>

</xml_diff>